<commit_message>
finalize: full-data run + updated report
</commit_message>
<xml_diff>
--- a/docs/Final Project Report.docx
+++ b/docs/Final Project Report.docx
@@ -1713,6 +1713,7 @@
     </w:p>
     <w:p>
       <w:pPr>
+        <w:keepNext/>
         <w:spacing w:line="480" w:lineRule="auto"/>
         <w:jc w:val="center"/>
         <w:rPr>
@@ -3609,6 +3610,7 @@
     </w:p>
     <w:p>
       <w:pPr>
+        <w:keepNext/>
         <w:spacing w:line="480" w:lineRule="auto"/>
         <w:jc w:val="center"/>
         <w:rPr>
@@ -4974,9 +4976,9 @@
     </w:p>
     <w:p>
       <w:pPr>
-        <w:pStyle w:val="Heading2"/>
-        <w:spacing w:after="80" w:line="480" w:lineRule="auto"/>
-        <w:jc w:val="both"/>
+        <w:keepNext/>
+        <w:spacing w:line="480" w:lineRule="auto"/>
+        <w:jc w:val="center"/>
         <w:rPr>
           <w:rFonts w:ascii="Times New Roman" w:eastAsia="Times New Roman" w:hAnsi="Times New Roman" w:cs="Times New Roman"/>
           <w:b/>
@@ -5340,9 +5342,9 @@
     </w:p>
     <w:p>
       <w:pPr>
-        <w:pStyle w:val="Heading2"/>
-        <w:spacing w:after="80" w:line="480" w:lineRule="auto"/>
-        <w:jc w:val="both"/>
+        <w:keepNext/>
+        <w:spacing w:line="480" w:lineRule="auto"/>
+        <w:jc w:val="center"/>
         <w:rPr>
           <w:rFonts w:ascii="Times New Roman" w:eastAsia="Times New Roman" w:hAnsi="Times New Roman" w:cs="Times New Roman"/>
           <w:b/>

</xml_diff>